<commit_message>
14th, input for Aug
</commit_message>
<xml_diff>
--- a/flow/20230927_hours/drafts/2024-07-u/01.07.docx
+++ b/flow/20230927_hours/drafts/2024-07-u/01.07.docx
@@ -4471,7 +4471,23 @@
           <w:color w:val="000000"/>
           <w:sz w:val="24"/>
         </w:rPr>
-        <w:t>Днесь у радості пісню возсилаймо, люди,</w:t>
+        <w:t xml:space="preserve">Днесь у радості пісню </w:t>
+      </w:r>
+      <w:r>
+        <w:rPr>
+          <w:rFonts w:ascii="Times New Roman" w:hAnsi="Times New Roman"/>
+          <w:color w:val="000000"/>
+          <w:sz w:val="24"/>
+        </w:rPr>
+        <w:t>возсилаймо</w:t>
+      </w:r>
+      <w:r>
+        <w:rPr>
+          <w:rFonts w:ascii="Times New Roman" w:hAnsi="Times New Roman"/>
+          <w:color w:val="000000"/>
+          <w:sz w:val="24"/>
+        </w:rPr>
+        <w:t>, люди,</w:t>
       </w:r>
       <w:r>
         <w:rPr>
@@ -4516,7 +4532,39 @@
           <w:color w:val="000000"/>
           <w:sz w:val="24"/>
         </w:rPr>
-        <w:t xml:space="preserve"> Косму і Дам’яна, до яких зовемо:</w:t>
+        <w:t xml:space="preserve"> </w:t>
+      </w:r>
+      <w:r>
+        <w:rPr>
+          <w:rFonts w:ascii="Times New Roman" w:hAnsi="Times New Roman"/>
+          <w:color w:val="000000"/>
+          <w:sz w:val="24"/>
+        </w:rPr>
+        <w:t>Косму</w:t>
+      </w:r>
+      <w:r>
+        <w:rPr>
+          <w:rFonts w:ascii="Times New Roman" w:hAnsi="Times New Roman"/>
+          <w:color w:val="000000"/>
+          <w:sz w:val="24"/>
+        </w:rPr>
+        <w:t xml:space="preserve"> і </w:t>
+      </w:r>
+      <w:r>
+        <w:rPr>
+          <w:rFonts w:ascii="Times New Roman" w:hAnsi="Times New Roman"/>
+          <w:color w:val="000000"/>
+          <w:sz w:val="24"/>
+        </w:rPr>
+        <w:t>Дам’яна</w:t>
+      </w:r>
+      <w:r>
+        <w:rPr>
+          <w:rFonts w:ascii="Times New Roman" w:hAnsi="Times New Roman"/>
+          <w:color w:val="000000"/>
+          <w:sz w:val="24"/>
+        </w:rPr>
+        <w:t>, до яких зовемо:</w:t>
       </w:r>
       <w:r>
         <w:rPr>
@@ -10218,7 +10266,23 @@
           <w:color w:val="000000"/>
           <w:sz w:val="24"/>
         </w:rPr>
-        <w:t>Днесь у радості пісню возсилаймо, люди,</w:t>
+        <w:t xml:space="preserve">Днесь у радості пісню </w:t>
+      </w:r>
+      <w:r>
+        <w:rPr>
+          <w:rFonts w:ascii="Times New Roman" w:hAnsi="Times New Roman"/>
+          <w:color w:val="000000"/>
+          <w:sz w:val="24"/>
+        </w:rPr>
+        <w:t>возсилаймо</w:t>
+      </w:r>
+      <w:r>
+        <w:rPr>
+          <w:rFonts w:ascii="Times New Roman" w:hAnsi="Times New Roman"/>
+          <w:color w:val="000000"/>
+          <w:sz w:val="24"/>
+        </w:rPr>
+        <w:t>, люди,</w:t>
       </w:r>
       <w:r>
         <w:rPr>
@@ -10263,7 +10327,39 @@
           <w:color w:val="000000"/>
           <w:sz w:val="24"/>
         </w:rPr>
-        <w:t xml:space="preserve"> Косму і Дам’яна, до яких зовемо:</w:t>
+        <w:t xml:space="preserve"> </w:t>
+      </w:r>
+      <w:r>
+        <w:rPr>
+          <w:rFonts w:ascii="Times New Roman" w:hAnsi="Times New Roman"/>
+          <w:color w:val="000000"/>
+          <w:sz w:val="24"/>
+        </w:rPr>
+        <w:t>Косму</w:t>
+      </w:r>
+      <w:r>
+        <w:rPr>
+          <w:rFonts w:ascii="Times New Roman" w:hAnsi="Times New Roman"/>
+          <w:color w:val="000000"/>
+          <w:sz w:val="24"/>
+        </w:rPr>
+        <w:t xml:space="preserve"> і </w:t>
+      </w:r>
+      <w:r>
+        <w:rPr>
+          <w:rFonts w:ascii="Times New Roman" w:hAnsi="Times New Roman"/>
+          <w:color w:val="000000"/>
+          <w:sz w:val="24"/>
+        </w:rPr>
+        <w:t>Дам’яна</w:t>
+      </w:r>
+      <w:r>
+        <w:rPr>
+          <w:rFonts w:ascii="Times New Roman" w:hAnsi="Times New Roman"/>
+          <w:color w:val="000000"/>
+          <w:sz w:val="24"/>
+        </w:rPr>
+        <w:t>, до яких зовемо:</w:t>
       </w:r>
       <w:r>
         <w:rPr>

</xml_diff>